<commit_message>
docs: update Lab 3 corrections
</commit_message>
<xml_diff>
--- a/docs/ПСПР. Исправления Лаб.3.docx
+++ b/docs/ПСПР. Исправления Лаб.3.docx
@@ -4,12 +4,313 @@
   <w:body>
     <w:p>
       <w:pPr>
+        <w:pStyle w:val="a7"/>
+        <w:numPr>
+          <w:ilvl w:val="0"/>
+          <w:numId w:val="1"/>
+        </w:numPr>
         <w:rPr>
           <w:rFonts w:ascii="Times New Roman" w:hAnsi="Times New Roman" w:cs="Times New Roman"/>
+          <w:b/>
+          <w:bCs/>
+          <w:sz w:val="28"/>
+          <w:szCs w:val="28"/>
+          <w:lang w:val="en-US"/>
+        </w:rPr>
+      </w:pPr>
+      <w:r>
+        <w:rPr>
+          <w:rFonts w:ascii="Times New Roman" w:hAnsi="Times New Roman" w:cs="Times New Roman"/>
+          <w:b/>
+          <w:bCs/>
           <w:sz w:val="28"/>
           <w:szCs w:val="28"/>
         </w:rPr>
-      </w:pPr>
+        <w:t>В коллекции только 10 запросов</w:t>
+      </w:r>
+    </w:p>
+    <w:p>
+      <w:pPr>
+        <w:jc w:val="center"/>
+        <w:rPr>
+          <w:rFonts w:ascii="Times New Roman" w:hAnsi="Times New Roman" w:cs="Times New Roman"/>
+          <w:b/>
+          <w:bCs/>
+          <w:sz w:val="28"/>
+          <w:szCs w:val="28"/>
+          <w:lang w:val="en-US"/>
+        </w:rPr>
+      </w:pPr>
+      <w:r>
+        <w:rPr>
+          <w:rFonts w:ascii="Times New Roman" w:hAnsi="Times New Roman" w:cs="Times New Roman"/>
+          <w:b/>
+          <w:bCs/>
+          <w:sz w:val="28"/>
+          <w:szCs w:val="28"/>
+          <w:lang w:val="en-US"/>
+        </w:rPr>
+        <w:drawing>
+          <wp:inline distT="0" distB="0" distL="0" distR="0" wp14:anchorId="09E26C59" wp14:editId="670A854D">
+            <wp:extent cx="3708400" cy="3657600"/>
+            <wp:effectExtent l="0" t="0" r="0" b="0"/>
+            <wp:docPr id="693444084" name="Рисунок 1" descr="Изображение выглядит как текст, снимок экрана, Шрифт&#10;&#10;Содержимое, созданное искусственным интеллектом, может быть неверным."/>
+            <wp:cNvGraphicFramePr>
+              <a:graphicFrameLocks xmlns:a="http://schemas.openxmlformats.org/drawingml/2006/main" noChangeAspect="1"/>
+            </wp:cNvGraphicFramePr>
+            <a:graphic xmlns:a="http://schemas.openxmlformats.org/drawingml/2006/main">
+              <a:graphicData uri="http://schemas.openxmlformats.org/drawingml/2006/picture">
+                <pic:pic xmlns:pic="http://schemas.openxmlformats.org/drawingml/2006/picture">
+                  <pic:nvPicPr>
+                    <pic:cNvPr id="693444084" name="Рисунок 1" descr="Изображение выглядит как текст, снимок экрана, Шрифт&#10;&#10;Содержимое, созданное искусственным интеллектом, может быть неверным."/>
+                    <pic:cNvPicPr/>
+                  </pic:nvPicPr>
+                  <pic:blipFill>
+                    <a:blip r:embed="rId5"/>
+                    <a:stretch>
+                      <a:fillRect/>
+                    </a:stretch>
+                  </pic:blipFill>
+                  <pic:spPr>
+                    <a:xfrm>
+                      <a:off x="0" y="0"/>
+                      <a:ext cx="3708400" cy="3657600"/>
+                    </a:xfrm>
+                    <a:prstGeom prst="rect">
+                      <a:avLst/>
+                    </a:prstGeom>
+                  </pic:spPr>
+                </pic:pic>
+              </a:graphicData>
+            </a:graphic>
+          </wp:inline>
+        </w:drawing>
+      </w:r>
+    </w:p>
+    <w:p>
+      <w:pPr>
+        <w:rPr>
+          <w:rFonts w:ascii="Times New Roman" w:hAnsi="Times New Roman" w:cs="Times New Roman"/>
+          <w:b/>
+          <w:bCs/>
+          <w:sz w:val="28"/>
+          <w:szCs w:val="28"/>
+          <w:lang w:val="en-US"/>
+        </w:rPr>
+      </w:pPr>
+    </w:p>
+    <w:p>
+      <w:pPr>
+        <w:pStyle w:val="a7"/>
+        <w:numPr>
+          <w:ilvl w:val="0"/>
+          <w:numId w:val="1"/>
+        </w:numPr>
+        <w:rPr>
+          <w:rFonts w:ascii="Times New Roman" w:hAnsi="Times New Roman" w:cs="Times New Roman"/>
+          <w:b/>
+          <w:bCs/>
+          <w:sz w:val="28"/>
+          <w:szCs w:val="28"/>
+        </w:rPr>
+      </w:pPr>
+      <w:r>
+        <w:rPr>
+          <w:rFonts w:ascii="Times New Roman" w:hAnsi="Times New Roman" w:cs="Times New Roman"/>
+          <w:b/>
+          <w:bCs/>
+          <w:sz w:val="28"/>
+          <w:szCs w:val="28"/>
+        </w:rPr>
+        <w:t>Добавлен признак 0/1 и убрана вложенность у пользователя</w:t>
+      </w:r>
+    </w:p>
+    <w:p>
+      <w:pPr>
+        <w:rPr>
+          <w:rFonts w:ascii="Times New Roman" w:hAnsi="Times New Roman" w:cs="Times New Roman"/>
+          <w:b/>
+          <w:bCs/>
+          <w:sz w:val="28"/>
+          <w:szCs w:val="28"/>
+          <w:lang w:val="en-US"/>
+        </w:rPr>
+      </w:pPr>
+      <w:r>
+        <w:rPr>
+          <w:rFonts w:ascii="Times New Roman" w:hAnsi="Times New Roman" w:cs="Times New Roman"/>
+          <w:b/>
+          <w:bCs/>
+          <w:sz w:val="28"/>
+          <w:szCs w:val="28"/>
+          <w:lang w:val="en-US"/>
+        </w:rPr>
+        <w:drawing>
+          <wp:inline distT="0" distB="0" distL="0" distR="0" wp14:anchorId="3C9223E4" wp14:editId="70429995">
+            <wp:extent cx="5940425" cy="2079625"/>
+            <wp:effectExtent l="0" t="0" r="3175" b="3175"/>
+            <wp:docPr id="647305401" name="Рисунок 1" descr="Изображение выглядит как снимок экрана, текст&#10;&#10;Содержимое, созданное искусственным интеллектом, может быть неверным."/>
+            <wp:cNvGraphicFramePr>
+              <a:graphicFrameLocks xmlns:a="http://schemas.openxmlformats.org/drawingml/2006/main" noChangeAspect="1"/>
+            </wp:cNvGraphicFramePr>
+            <a:graphic xmlns:a="http://schemas.openxmlformats.org/drawingml/2006/main">
+              <a:graphicData uri="http://schemas.openxmlformats.org/drawingml/2006/picture">
+                <pic:pic xmlns:pic="http://schemas.openxmlformats.org/drawingml/2006/picture">
+                  <pic:nvPicPr>
+                    <pic:cNvPr id="647305401" name="Рисунок 1" descr="Изображение выглядит как снимок экрана, текст&#10;&#10;Содержимое, созданное искусственным интеллектом, может быть неверным."/>
+                    <pic:cNvPicPr/>
+                  </pic:nvPicPr>
+                  <pic:blipFill>
+                    <a:blip r:embed="rId6"/>
+                    <a:stretch>
+                      <a:fillRect/>
+                    </a:stretch>
+                  </pic:blipFill>
+                  <pic:spPr>
+                    <a:xfrm>
+                      <a:off x="0" y="0"/>
+                      <a:ext cx="5940425" cy="2079625"/>
+                    </a:xfrm>
+                    <a:prstGeom prst="rect">
+                      <a:avLst/>
+                    </a:prstGeom>
+                  </pic:spPr>
+                </pic:pic>
+              </a:graphicData>
+            </a:graphic>
+          </wp:inline>
+        </w:drawing>
+      </w:r>
+    </w:p>
+    <w:p>
+      <w:pPr>
+        <w:rPr>
+          <w:rFonts w:ascii="Times New Roman" w:hAnsi="Times New Roman" w:cs="Times New Roman"/>
+          <w:b/>
+          <w:bCs/>
+          <w:sz w:val="28"/>
+          <w:szCs w:val="28"/>
+          <w:lang w:val="en-US"/>
+        </w:rPr>
+      </w:pPr>
+      <w:r>
+        <w:rPr>
+          <w:rFonts w:ascii="Times New Roman" w:hAnsi="Times New Roman" w:cs="Times New Roman"/>
+          <w:b/>
+          <w:bCs/>
+          <w:sz w:val="28"/>
+          <w:szCs w:val="28"/>
+          <w:lang w:val="en-US"/>
+        </w:rPr>
+        <w:br w:type="page"/>
+      </w:r>
+    </w:p>
+    <w:p>
+      <w:pPr>
+        <w:rPr>
+          <w:rFonts w:ascii="Times New Roman" w:hAnsi="Times New Roman" w:cs="Times New Roman"/>
+          <w:b/>
+          <w:bCs/>
+          <w:sz w:val="28"/>
+          <w:szCs w:val="28"/>
+          <w:lang w:val="en-US"/>
+        </w:rPr>
+      </w:pPr>
+    </w:p>
+    <w:p>
+      <w:pPr>
+        <w:pStyle w:val="a7"/>
+        <w:numPr>
+          <w:ilvl w:val="0"/>
+          <w:numId w:val="1"/>
+        </w:numPr>
+        <w:rPr>
+          <w:rFonts w:ascii="Times New Roman" w:hAnsi="Times New Roman" w:cs="Times New Roman"/>
+          <w:b/>
+          <w:bCs/>
+          <w:sz w:val="28"/>
+          <w:szCs w:val="28"/>
+          <w:lang w:val="en-US"/>
+        </w:rPr>
+      </w:pPr>
+      <w:r>
+        <w:rPr>
+          <w:rFonts w:ascii="Times New Roman" w:hAnsi="Times New Roman" w:cs="Times New Roman"/>
+          <w:b/>
+          <w:bCs/>
+          <w:sz w:val="28"/>
+          <w:szCs w:val="28"/>
+        </w:rPr>
+        <w:t xml:space="preserve">Скриншот </w:t>
+      </w:r>
+      <w:r>
+        <w:rPr>
+          <w:rFonts w:ascii="Times New Roman" w:hAnsi="Times New Roman" w:cs="Times New Roman"/>
+          <w:b/>
+          <w:bCs/>
+          <w:sz w:val="28"/>
+          <w:szCs w:val="28"/>
+          <w:lang w:val="en-US"/>
+        </w:rPr>
+        <w:t>README</w:t>
+      </w:r>
+    </w:p>
+    <w:p>
+      <w:pPr>
+        <w:rPr>
+          <w:rFonts w:ascii="Times New Roman" w:hAnsi="Times New Roman" w:cs="Times New Roman"/>
+          <w:b/>
+          <w:bCs/>
+          <w:sz w:val="28"/>
+          <w:szCs w:val="28"/>
+          <w:lang w:val="en-US"/>
+        </w:rPr>
+      </w:pPr>
+      <w:r>
+        <w:rPr>
+          <w:rFonts w:ascii="Times New Roman" w:hAnsi="Times New Roman" w:cs="Times New Roman"/>
+          <w:b/>
+          <w:bCs/>
+          <w:sz w:val="28"/>
+          <w:szCs w:val="28"/>
+          <w:lang w:val="en-US"/>
+        </w:rPr>
+        <w:drawing>
+          <wp:inline distT="0" distB="0" distL="0" distR="0" wp14:anchorId="16303B86" wp14:editId="7C58A9D4">
+            <wp:extent cx="5940425" cy="5822315"/>
+            <wp:effectExtent l="0" t="0" r="3175" b="0"/>
+            <wp:docPr id="1124029616" name="Рисунок 1" descr="Изображение выглядит как текст, снимок экрана, Шрифт&#10;&#10;Содержимое, созданное искусственным интеллектом, может быть неверным."/>
+            <wp:cNvGraphicFramePr>
+              <a:graphicFrameLocks xmlns:a="http://schemas.openxmlformats.org/drawingml/2006/main" noChangeAspect="1"/>
+            </wp:cNvGraphicFramePr>
+            <a:graphic xmlns:a="http://schemas.openxmlformats.org/drawingml/2006/main">
+              <a:graphicData uri="http://schemas.openxmlformats.org/drawingml/2006/picture">
+                <pic:pic xmlns:pic="http://schemas.openxmlformats.org/drawingml/2006/picture">
+                  <pic:nvPicPr>
+                    <pic:cNvPr id="1124029616" name="Рисунок 1" descr="Изображение выглядит как текст, снимок экрана, Шрифт&#10;&#10;Содержимое, созданное искусственным интеллектом, может быть неверным."/>
+                    <pic:cNvPicPr/>
+                  </pic:nvPicPr>
+                  <pic:blipFill>
+                    <a:blip r:embed="rId7"/>
+                    <a:stretch>
+                      <a:fillRect/>
+                    </a:stretch>
+                  </pic:blipFill>
+                  <pic:spPr>
+                    <a:xfrm>
+                      <a:off x="0" y="0"/>
+                      <a:ext cx="5940425" cy="5822315"/>
+                    </a:xfrm>
+                    <a:prstGeom prst="rect">
+                      <a:avLst/>
+                    </a:prstGeom>
+                  </pic:spPr>
+                </pic:pic>
+              </a:graphicData>
+            </a:graphic>
+          </wp:inline>
+        </w:drawing>
+      </w:r>
     </w:p>
     <w:sectPr>
       <w:pgSz w:w="11906" w:h="16838"/>
@@ -19,6 +320,103 @@
     </w:sectPr>
   </w:body>
 </w:document>
+</file>
+
+<file path=word/numbering.xml><?xml version="1.0" encoding="utf-8"?>
+<w:numbering xmlns:wpc="http://schemas.microsoft.com/office/word/2010/wordprocessingCanvas" xmlns:cx="http://schemas.microsoft.com/office/drawing/2014/chartex" xmlns:cx1="http://schemas.microsoft.com/office/drawing/2015/9/8/chartex" xmlns:cx2="http://schemas.microsoft.com/office/drawing/2015/10/21/chartex" xmlns:cx3="http://schemas.microsoft.com/office/drawing/2016/5/9/chartex" xmlns:cx4="http://schemas.microsoft.com/office/drawing/2016/5/10/chartex" xmlns:cx5="http://schemas.microsoft.com/office/drawing/2016/5/11/chartex" xmlns:cx6="http://schemas.microsoft.com/office/drawing/2016/5/12/chartex" xmlns:cx7="http://schemas.microsoft.com/office/drawing/2016/5/13/chartex" xmlns:cx8="http://schemas.microsoft.com/office/drawing/2016/5/14/chartex" xmlns:mc="http://schemas.openxmlformats.org/markup-compatibility/2006" xmlns:aink="http://schemas.microsoft.com/office/drawing/2016/ink" xmlns:am3d="http://schemas.microsoft.com/office/drawing/2017/model3d" xmlns:o="urn:schemas-microsoft-com:office:office" xmlns:oel="http://schemas.microsoft.com/office/2019/extlst" xmlns:r="http://schemas.openxmlformats.org/officeDocument/2006/relationships" xmlns:m="http://schemas.openxmlformats.org/officeDocument/2006/math" xmlns:v="urn:schemas-microsoft-com:vml" xmlns:wp14="http://schemas.microsoft.com/office/word/2010/wordprocessingDrawing" xmlns:wp="http://schemas.openxmlformats.org/drawingml/2006/wordprocessingDrawing" xmlns:w10="urn:schemas-microsoft-com:office:word" xmlns:w="http://schemas.openxmlformats.org/wordprocessingml/2006/main" xmlns:w14="http://schemas.microsoft.com/office/word/2010/wordml" xmlns:w15="http://schemas.microsoft.com/office/word/2012/wordml" xmlns:w16cex="http://schemas.microsoft.com/office/word/2018/wordml/cex" xmlns:w16cid="http://schemas.microsoft.com/office/word/2016/wordml/cid" xmlns:w16="http://schemas.microsoft.com/office/word/2018/wordml" xmlns:w16du="http://schemas.microsoft.com/office/word/2023/wordml/word16du" xmlns:w16sdtdh="http://schemas.microsoft.com/office/word/2020/wordml/sdtdatahash" xmlns:w16sdtfl="http://schemas.microsoft.com/office/word/2024/wordml/sdtformatlock" xmlns:w16se="http://schemas.microsoft.com/office/word/2015/wordml/symex" xmlns:wpg="http://schemas.microsoft.com/office/word/2010/wordprocessingGroup" xmlns:wpi="http://schemas.microsoft.com/office/word/2010/wordprocessingInk" xmlns:wne="http://schemas.microsoft.com/office/word/2006/wordml" xmlns:wps="http://schemas.microsoft.com/office/word/2010/wordprocessingShape" mc:Ignorable="w14 w15 w16se w16cid w16 w16cex w16sdtdh w16sdtfl w16du wp14">
+  <w:abstractNum w:abstractNumId="0" w15:restartNumberingAfterBreak="0">
+    <w:nsid w:val="2C185BFD"/>
+    <w:multiLevelType w:val="hybridMultilevel"/>
+    <w:tmpl w:val="F8F6A8C6"/>
+    <w:lvl w:ilvl="0" w:tplc="0419000F">
+      <w:start w:val="1"/>
+      <w:numFmt w:val="decimal"/>
+      <w:lvlText w:val="%1."/>
+      <w:lvlJc w:val="left"/>
+      <w:pPr>
+        <w:ind w:left="720" w:hanging="360"/>
+      </w:pPr>
+      <w:rPr>
+        <w:rFonts w:hint="default"/>
+      </w:rPr>
+    </w:lvl>
+    <w:lvl w:ilvl="1" w:tplc="04190019" w:tentative="1">
+      <w:start w:val="1"/>
+      <w:numFmt w:val="lowerLetter"/>
+      <w:lvlText w:val="%2."/>
+      <w:lvlJc w:val="left"/>
+      <w:pPr>
+        <w:ind w:left="1440" w:hanging="360"/>
+      </w:pPr>
+    </w:lvl>
+    <w:lvl w:ilvl="2" w:tplc="0419001B" w:tentative="1">
+      <w:start w:val="1"/>
+      <w:numFmt w:val="lowerRoman"/>
+      <w:lvlText w:val="%3."/>
+      <w:lvlJc w:val="right"/>
+      <w:pPr>
+        <w:ind w:left="2160" w:hanging="180"/>
+      </w:pPr>
+    </w:lvl>
+    <w:lvl w:ilvl="3" w:tplc="0419000F" w:tentative="1">
+      <w:start w:val="1"/>
+      <w:numFmt w:val="decimal"/>
+      <w:lvlText w:val="%4."/>
+      <w:lvlJc w:val="left"/>
+      <w:pPr>
+        <w:ind w:left="2880" w:hanging="360"/>
+      </w:pPr>
+    </w:lvl>
+    <w:lvl w:ilvl="4" w:tplc="04190019" w:tentative="1">
+      <w:start w:val="1"/>
+      <w:numFmt w:val="lowerLetter"/>
+      <w:lvlText w:val="%5."/>
+      <w:lvlJc w:val="left"/>
+      <w:pPr>
+        <w:ind w:left="3600" w:hanging="360"/>
+      </w:pPr>
+    </w:lvl>
+    <w:lvl w:ilvl="5" w:tplc="0419001B" w:tentative="1">
+      <w:start w:val="1"/>
+      <w:numFmt w:val="lowerRoman"/>
+      <w:lvlText w:val="%6."/>
+      <w:lvlJc w:val="right"/>
+      <w:pPr>
+        <w:ind w:left="4320" w:hanging="180"/>
+      </w:pPr>
+    </w:lvl>
+    <w:lvl w:ilvl="6" w:tplc="0419000F" w:tentative="1">
+      <w:start w:val="1"/>
+      <w:numFmt w:val="decimal"/>
+      <w:lvlText w:val="%7."/>
+      <w:lvlJc w:val="left"/>
+      <w:pPr>
+        <w:ind w:left="5040" w:hanging="360"/>
+      </w:pPr>
+    </w:lvl>
+    <w:lvl w:ilvl="7" w:tplc="04190019" w:tentative="1">
+      <w:start w:val="1"/>
+      <w:numFmt w:val="lowerLetter"/>
+      <w:lvlText w:val="%8."/>
+      <w:lvlJc w:val="left"/>
+      <w:pPr>
+        <w:ind w:left="5760" w:hanging="360"/>
+      </w:pPr>
+    </w:lvl>
+    <w:lvl w:ilvl="8" w:tplc="0419001B" w:tentative="1">
+      <w:start w:val="1"/>
+      <w:numFmt w:val="lowerRoman"/>
+      <w:lvlText w:val="%9."/>
+      <w:lvlJc w:val="right"/>
+      <w:pPr>
+        <w:ind w:left="6480" w:hanging="180"/>
+      </w:pPr>
+    </w:lvl>
+  </w:abstractNum>
+  <w:num w:numId="1" w16cid:durableId="1606885951">
+    <w:abstractNumId w:val="0"/>
+  </w:num>
+</w:numbering>
 </file>
 
 <file path=word/styles.xml><?xml version="1.0" encoding="utf-8"?>

</xml_diff>

<commit_message>
docs: add Lab 4 demonstration and update Lab 3 corrections
- add Lab 4 demonstration report and ТЗ example
- update Lab 3 corrections
- stop tracking .DS_Store

Co-Authored-By: Claude Opus 5.5 <noreply@anthropic.com>
</commit_message>
<xml_diff>
--- a/docs/ПСПР. Исправления Лаб.3.docx
+++ b/docs/ПСПР. Исправления Лаб.3.docx
@@ -46,6 +46,7 @@
           <w:rFonts w:ascii="Times New Roman" w:hAnsi="Times New Roman" w:cs="Times New Roman"/>
           <w:b/>
           <w:bCs/>
+          <w:noProof/>
           <w:sz w:val="28"/>
           <w:szCs w:val="28"/>
           <w:lang w:val="en-US"/>
@@ -141,6 +142,7 @@
           <w:rFonts w:ascii="Times New Roman" w:hAnsi="Times New Roman" w:cs="Times New Roman"/>
           <w:b/>
           <w:bCs/>
+          <w:noProof/>
           <w:sz w:val="28"/>
           <w:szCs w:val="28"/>
           <w:lang w:val="en-US"/>
@@ -271,6 +273,7 @@
           <w:rFonts w:ascii="Times New Roman" w:hAnsi="Times New Roman" w:cs="Times New Roman"/>
           <w:b/>
           <w:bCs/>
+          <w:noProof/>
           <w:sz w:val="28"/>
           <w:szCs w:val="28"/>
           <w:lang w:val="en-US"/>
@@ -300,6 +303,215 @@
                     <a:xfrm>
                       <a:off x="0" y="0"/>
                       <a:ext cx="5940425" cy="5822315"/>
+                    </a:xfrm>
+                    <a:prstGeom prst="rect">
+                      <a:avLst/>
+                    </a:prstGeom>
+                  </pic:spPr>
+                </pic:pic>
+              </a:graphicData>
+            </a:graphic>
+          </wp:inline>
+        </w:drawing>
+      </w:r>
+    </w:p>
+    <w:p>
+      <w:pPr>
+        <w:rPr>
+          <w:rFonts w:ascii="Times New Roman" w:hAnsi="Times New Roman" w:cs="Times New Roman"/>
+          <w:b/>
+          <w:bCs/>
+          <w:sz w:val="28"/>
+          <w:szCs w:val="28"/>
+        </w:rPr>
+      </w:pPr>
+      <w:r>
+        <w:rPr>
+          <w:rFonts w:ascii="Times New Roman" w:hAnsi="Times New Roman" w:cs="Times New Roman"/>
+          <w:b/>
+          <w:bCs/>
+          <w:sz w:val="28"/>
+          <w:szCs w:val="28"/>
+          <w:lang w:val="en-US"/>
+        </w:rPr>
+        <w:br w:type="page"/>
+      </w:r>
+    </w:p>
+    <w:p>
+      <w:pPr>
+        <w:pStyle w:val="a7"/>
+        <w:numPr>
+          <w:ilvl w:val="0"/>
+          <w:numId w:val="1"/>
+        </w:numPr>
+        <w:rPr>
+          <w:rFonts w:ascii="Times New Roman" w:hAnsi="Times New Roman" w:cs="Times New Roman"/>
+          <w:b/>
+          <w:bCs/>
+          <w:sz w:val="28"/>
+          <w:szCs w:val="28"/>
+          <w:lang w:val="en-US"/>
+        </w:rPr>
+      </w:pPr>
+      <w:r>
+        <w:rPr>
+          <w:rFonts w:ascii="Times New Roman" w:hAnsi="Times New Roman" w:cs="Times New Roman"/>
+          <w:b/>
+          <w:bCs/>
+          <w:sz w:val="28"/>
+          <w:szCs w:val="28"/>
+          <w:lang w:val="en-US"/>
+        </w:rPr>
+        <w:lastRenderedPageBreak/>
+        <w:t xml:space="preserve">ER </w:t>
+      </w:r>
+      <w:r>
+        <w:rPr>
+          <w:rFonts w:ascii="Times New Roman" w:hAnsi="Times New Roman" w:cs="Times New Roman"/>
+          <w:b/>
+          <w:bCs/>
+          <w:sz w:val="28"/>
+          <w:szCs w:val="28"/>
+        </w:rPr>
+        <w:t>диаграмма</w:t>
+      </w:r>
+    </w:p>
+    <w:p>
+      <w:pPr>
+        <w:rPr>
+          <w:rFonts w:ascii="Times New Roman" w:hAnsi="Times New Roman" w:cs="Times New Roman"/>
+          <w:b/>
+          <w:bCs/>
+          <w:sz w:val="28"/>
+          <w:szCs w:val="28"/>
+        </w:rPr>
+      </w:pPr>
+      <w:r>
+        <w:rPr>
+          <w:rFonts w:ascii="Times New Roman" w:hAnsi="Times New Roman" w:cs="Times New Roman"/>
+          <w:b/>
+          <w:bCs/>
+          <w:sz w:val="28"/>
+          <w:szCs w:val="28"/>
+        </w:rPr>
+        <w:drawing>
+          <wp:inline distT="0" distB="0" distL="0" distR="0" wp14:anchorId="41D27838" wp14:editId="3E1EA592">
+            <wp:extent cx="5940425" cy="4064635"/>
+            <wp:effectExtent l="0" t="0" r="3175" b="0"/>
+            <wp:docPr id="878686800" name="Рисунок 1" descr="Изображение выглядит как текст, чек, снимок экрана, Шрифт&#10;&#10;Содержимое, созданное искусственным интеллектом, может быть неверным."/>
+            <wp:cNvGraphicFramePr>
+              <a:graphicFrameLocks xmlns:a="http://schemas.openxmlformats.org/drawingml/2006/main" noChangeAspect="1"/>
+            </wp:cNvGraphicFramePr>
+            <a:graphic xmlns:a="http://schemas.openxmlformats.org/drawingml/2006/main">
+              <a:graphicData uri="http://schemas.openxmlformats.org/drawingml/2006/picture">
+                <pic:pic xmlns:pic="http://schemas.openxmlformats.org/drawingml/2006/picture">
+                  <pic:nvPicPr>
+                    <pic:cNvPr id="878686800" name="Рисунок 1" descr="Изображение выглядит как текст, чек, снимок экрана, Шрифт&#10;&#10;Содержимое, созданное искусственным интеллектом, может быть неверным."/>
+                    <pic:cNvPicPr/>
+                  </pic:nvPicPr>
+                  <pic:blipFill>
+                    <a:blip r:embed="rId8"/>
+                    <a:stretch>
+                      <a:fillRect/>
+                    </a:stretch>
+                  </pic:blipFill>
+                  <pic:spPr>
+                    <a:xfrm>
+                      <a:off x="0" y="0"/>
+                      <a:ext cx="5940425" cy="4064635"/>
+                    </a:xfrm>
+                    <a:prstGeom prst="rect">
+                      <a:avLst/>
+                    </a:prstGeom>
+                  </pic:spPr>
+                </pic:pic>
+              </a:graphicData>
+            </a:graphic>
+          </wp:inline>
+        </w:drawing>
+      </w:r>
+    </w:p>
+    <w:p>
+      <w:pPr>
+        <w:rPr>
+          <w:rFonts w:ascii="Times New Roman" w:hAnsi="Times New Roman" w:cs="Times New Roman"/>
+          <w:b/>
+          <w:bCs/>
+          <w:sz w:val="28"/>
+          <w:szCs w:val="28"/>
+        </w:rPr>
+      </w:pPr>
+    </w:p>
+    <w:p>
+      <w:pPr>
+        <w:pStyle w:val="a7"/>
+        <w:numPr>
+          <w:ilvl w:val="0"/>
+          <w:numId w:val="1"/>
+        </w:numPr>
+        <w:rPr>
+          <w:rFonts w:ascii="Times New Roman" w:hAnsi="Times New Roman" w:cs="Times New Roman"/>
+          <w:b/>
+          <w:bCs/>
+          <w:sz w:val="28"/>
+          <w:szCs w:val="28"/>
+        </w:rPr>
+      </w:pPr>
+      <w:r>
+        <w:rPr>
+          <w:rFonts w:ascii="Times New Roman" w:hAnsi="Times New Roman" w:cs="Times New Roman"/>
+          <w:b/>
+          <w:bCs/>
+          <w:sz w:val="28"/>
+          <w:szCs w:val="28"/>
+        </w:rPr>
+        <w:t>Диаграмма классов</w:t>
+      </w:r>
+    </w:p>
+    <w:p>
+      <w:pPr>
+        <w:rPr>
+          <w:rFonts w:ascii="Times New Roman" w:hAnsi="Times New Roman" w:cs="Times New Roman"/>
+          <w:b/>
+          <w:bCs/>
+          <w:sz w:val="28"/>
+          <w:szCs w:val="28"/>
+        </w:rPr>
+      </w:pPr>
+      <w:r>
+        <w:rPr>
+          <w:rFonts w:ascii="Times New Roman" w:hAnsi="Times New Roman" w:cs="Times New Roman"/>
+          <w:b/>
+          <w:bCs/>
+          <w:sz w:val="28"/>
+          <w:szCs w:val="28"/>
+        </w:rPr>
+        <w:lastRenderedPageBreak/>
+        <w:drawing>
+          <wp:inline distT="0" distB="0" distL="0" distR="0" wp14:anchorId="1AF92839" wp14:editId="13E7E9FA">
+            <wp:extent cx="5940425" cy="8199755"/>
+            <wp:effectExtent l="0" t="0" r="3175" b="4445"/>
+            <wp:docPr id="912915455" name="Рисунок 1" descr="Изображение выглядит как диаграмма, текст, План, Технический чертеж&#10;&#10;Содержимое, созданное искусственным интеллектом, может быть неверным."/>
+            <wp:cNvGraphicFramePr>
+              <a:graphicFrameLocks xmlns:a="http://schemas.openxmlformats.org/drawingml/2006/main" noChangeAspect="1"/>
+            </wp:cNvGraphicFramePr>
+            <a:graphic xmlns:a="http://schemas.openxmlformats.org/drawingml/2006/main">
+              <a:graphicData uri="http://schemas.openxmlformats.org/drawingml/2006/picture">
+                <pic:pic xmlns:pic="http://schemas.openxmlformats.org/drawingml/2006/picture">
+                  <pic:nvPicPr>
+                    <pic:cNvPr id="912915455" name="Рисунок 1" descr="Изображение выглядит как диаграмма, текст, План, Технический чертеж&#10;&#10;Содержимое, созданное искусственным интеллектом, может быть неверным."/>
+                    <pic:cNvPicPr/>
+                  </pic:nvPicPr>
+                  <pic:blipFill>
+                    <a:blip r:embed="rId9"/>
+                    <a:stretch>
+                      <a:fillRect/>
+                    </a:stretch>
+                  </pic:blipFill>
+                  <pic:spPr>
+                    <a:xfrm>
+                      <a:off x="0" y="0"/>
+                      <a:ext cx="5940425" cy="8199755"/>
                     </a:xfrm>
                     <a:prstGeom prst="rect">
                       <a:avLst/>

</xml_diff>